<commit_message>
feat: implement forensic un-redaction engine, air-gapped Windows desktop application, and synthetic test suites
</commit_message>
<xml_diff>
--- a/Case_Study_Report_Document_Intelligence.docx
+++ b/Case_Study_Report_Document_Intelligence.docx
@@ -3686,7 +3686,7 @@
         <w:br/>
         <w:t xml:space="preserve">  "institutional_context": {</w:t>
         <w:br/>
-        <w:t xml:space="preserve">    "department": "DEPARTMENT OF ELECTRONICS AND COMMUNICATION ENGINEERING",</w:t>
+        <w:t xml:space="preserve">    "department": "DEPARTMENT OF COMPUTER SCIENCE &amp; ENGINEERING",</w:t>
         <w:br/>
         <w:t xml:space="preserve">    "institution_type": "Engineering &amp; Technology University"</w:t>
         <w:br/>
@@ -3696,7 +3696,7 @@
         <w:br/>
         <w:t xml:space="preserve">    "subject_title": "Introduction to Digital Image Processing",</w:t>
         <w:br/>
-        <w:t xml:space="preserve">    "course_code": "4ENCO1021",</w:t>
+        <w:t xml:space="preserve">    "course_code": "CS-4021",</w:t>
         <w:br/>
         <w:t xml:space="preserve">    "credits": 3</w:t>
         <w:br/>
@@ -3716,19 +3716,19 @@
         <w:br/>
         <w:t xml:space="preserve">  "student_record": {</w:t>
         <w:br/>
-        <w:t xml:space="preserve">    "student_name": "Maha Akshay R",</w:t>
+        <w:t xml:space="preserve">    "student_name": "Alex Morgan",</w:t>
         <w:br/>
-        <w:t xml:space="preserve">    "usn_registration_id": "24BBTCS352",</w:t>
+        <w:t xml:space="preserve">    "usn_registration_id": "STU-99281",</w:t>
         <w:br/>
-        <w:t xml:space="preserve">    "section": "F"</w:t>
+        <w:t xml:space="preserve">    "section": "A"</w:t>
         <w:br/>
         <w:t xml:space="preserve">  },</w:t>
         <w:br/>
         <w:t xml:space="preserve">  "faculty_evaluator": {</w:t>
         <w:br/>
-        <w:t xml:space="preserve">    "name": "Prof. Akshatha Bhat",</w:t>
+        <w:t xml:space="preserve">    "name": "Dr. Sarah Jenkins",</w:t>
         <w:br/>
-        <w:t xml:space="preserve">    "designation": "Assistant Professor"</w:t>
+        <w:t xml:space="preserve">    "designation": "Associate Professor"</w:t>
         <w:br/>
         <w:t xml:space="preserve">  }</w:t>
         <w:br/>

</xml_diff>